<commit_message>
fix: Lab Instructions are fixed
</commit_message>
<xml_diff>
--- a/exercises/lab_02_02/Lab Instructions.docx
+++ b/exercises/lab_02_02/Lab Instructions.docx
@@ -401,7 +401,7 @@
           <w:szCs w:val="24"/>
           <w:lang w:val="en-US"/>
         </w:rPr>
-        <w:t>Total words: 41</w:t>
+        <w:t>Total words: 45</w:t>
       </w:r>
       <w:r>
         <w:br/>
@@ -415,7 +415,7 @@
           <w:szCs w:val="24"/>
           <w:lang w:val="en-US"/>
         </w:rPr>
-        <w:t>Total sentences: 4</w:t>
+        <w:t>Total sentences: 5</w:t>
       </w:r>
       <w:r>
         <w:br/>
@@ -429,7 +429,7 @@
           <w:szCs w:val="24"/>
           <w:lang w:val="en-US"/>
         </w:rPr>
-        <w:t>Average word length: 4.32 characters</w:t>
+        <w:t>Average word length: 4.67 characters</w:t>
       </w:r>
       <w:r>
         <w:br/>
@@ -443,7 +443,7 @@
           <w:szCs w:val="24"/>
           <w:lang w:val="en-US"/>
         </w:rPr>
-        <w:t>Longest word: perfection</w:t>
+        <w:t>Longest word: programming</w:t>
       </w:r>
       <w:r>
         <w:br/>
@@ -457,7 +457,7 @@
           <w:szCs w:val="24"/>
           <w:lang w:val="en-US"/>
         </w:rPr>
-        <w:t>Most common word: 'the' (used 3 times)</w:t>
+        <w:t>Most common word: 'you' (used 4 times)</w:t>
       </w:r>
     </w:p>
     <w:p xmlns:wp14="http://schemas.microsoft.com/office/word/2010/wordml" wp14:paraId="7EED4ECE" wp14:textId="7855D56E">
@@ -485,7 +485,7 @@
           <w:szCs w:val="24"/>
           <w:lang w:val="en-US"/>
         </w:rPr>
-        <w:t xml:space="preserve"> 3. This is your </w:t>
+        <w:t xml:space="preserve"> This is your </w:t>
       </w:r>
       <w:r>
         <w:rPr>
@@ -1861,7 +1861,7 @@
           <w:szCs w:val="24"/>
           <w:lang w:val="en-US"/>
         </w:rPr>
-        <w:t>Expected: "The report should count 4 sentences in my sample text, since it has 2 periods, 1 exclamation point, and 1 question mark."</w:t>
+        <w:t>Expected: "The report should count 5 sentences in my sample text, since it has 3 periods, 1 exclamation point, and 1 question mark."</w:t>
       </w:r>
     </w:p>
     <w:p xmlns:wp14="http://schemas.microsoft.com/office/word/2010/wordml" wp14:paraId="676A8D2B" wp14:textId="0164DD60">
@@ -1888,7 +1888,7 @@
           <w:szCs w:val="24"/>
           <w:lang w:val="en-US"/>
         </w:rPr>
-        <w:t>Actual: "It only reports 2 sentences."</w:t>
+        <w:t>Actual: "It only reports 3 sentences."</w:t>
       </w:r>
     </w:p>
     <w:p xmlns:wp14="http://schemas.microsoft.com/office/word/2010/wordml" wp14:paraId="72512796" wp14:textId="3F5C0F50">

</xml_diff>